<commit_message>
chore: remove and update system-generated .DS_Store files
</commit_message>
<xml_diff>
--- a/reference/계약서 샘플/[모두싸인 계약서]주주간계약서_v1.0.docx
+++ b/reference/계약서 샘플/[모두싸인 계약서]주주간계약서_v1.0.docx
@@ -1,6 +1,6 @@
 
 <file path=word/document.xml><?xml version="1.0" encoding="utf-8"?>
-<w:document xmlns:wpc="http://schemas.microsoft.com/office/word/2010/wordprocessingCanvas" xmlns:cx="http://schemas.microsoft.com/office/drawing/2014/chartex" xmlns:cx1="http://schemas.microsoft.com/office/drawing/2015/9/8/chartex" xmlns:cx2="http://schemas.microsoft.com/office/drawing/2015/10/21/chartex" xmlns:cx3="http://schemas.microsoft.com/office/drawing/2016/5/9/chartex" xmlns:cx4="http://schemas.microsoft.com/office/drawing/2016/5/10/chartex" xmlns:cx5="http://schemas.microsoft.com/office/drawing/2016/5/11/chartex" xmlns:cx6="http://schemas.microsoft.com/office/drawing/2016/5/12/chartex" xmlns:cx7="http://schemas.microsoft.com/office/drawing/2016/5/13/chartex" xmlns:cx8="http://schemas.microsoft.com/office/drawing/2016/5/14/chartex" xmlns:mc="http://schemas.openxmlformats.org/markup-compatibility/2006" xmlns:aink="http://schemas.microsoft.com/office/drawing/2016/ink" xmlns:am3d="http://schemas.microsoft.com/office/drawing/2017/model3d" xmlns:o="urn:schemas-microsoft-com:office:office" xmlns:oel="http://schemas.microsoft.com/office/2019/extlst" xmlns:r="http://schemas.openxmlformats.org/officeDocument/2006/relationships" xmlns:m="http://schemas.openxmlformats.org/officeDocument/2006/math" xmlns:v="urn:schemas-microsoft-com:vml" xmlns:wp14="http://schemas.microsoft.com/office/word/2010/wordprocessingDrawing" xmlns:wp="http://schemas.openxmlformats.org/drawingml/2006/wordprocessingDrawing" xmlns:w10="urn:schemas-microsoft-com:office:word" xmlns:w="http://schemas.openxmlformats.org/wordprocessingml/2006/main" xmlns:w14="http://schemas.microsoft.com/office/word/2010/wordml" xmlns:w15="http://schemas.microsoft.com/office/word/2012/wordml" xmlns:w16cex="http://schemas.microsoft.com/office/word/2018/wordml/cex" xmlns:w16cid="http://schemas.microsoft.com/office/word/2016/wordml/cid" xmlns:w16="http://schemas.microsoft.com/office/word/2018/wordml" xmlns:w16du="http://schemas.microsoft.com/office/word/2023/wordml/word16du" xmlns:w16sdtdh="http://schemas.microsoft.com/office/word/2020/wordml/sdtdatahash" xmlns:w16sdtfl="http://schemas.microsoft.com/office/word/2024/wordml/sdtformatlock" xmlns:w16se="http://schemas.microsoft.com/office/word/2015/wordml/symex" xmlns:wpg="http://schemas.microsoft.com/office/word/2010/wordprocessingGroup" xmlns:wpi="http://schemas.microsoft.com/office/word/2010/wordprocessingInk" xmlns:wne="http://schemas.microsoft.com/office/word/2006/wordml" xmlns:wps="http://schemas.microsoft.com/office/word/2010/wordprocessingShape" mc:Ignorable="w14 w15 w16se w16cid w16 w16cex w16sdtdh w16sdtfl w16du wp14">
+<w:document xmlns:wpc="http://schemas.microsoft.com/office/word/2010/wordprocessingCanvas" xmlns:cx="http://schemas.microsoft.com/office/drawing/2014/chartex" xmlns:cx1="http://schemas.microsoft.com/office/drawing/2015/9/8/chartex" xmlns:cx2="http://schemas.microsoft.com/office/drawing/2015/10/21/chartex" xmlns:cx3="http://schemas.microsoft.com/office/drawing/2016/5/9/chartex" xmlns:cx4="http://schemas.microsoft.com/office/drawing/2016/5/10/chartex" xmlns:cx5="http://schemas.microsoft.com/office/drawing/2016/5/11/chartex" xmlns:cx6="http://schemas.microsoft.com/office/drawing/2016/5/12/chartex" xmlns:cx7="http://schemas.microsoft.com/office/drawing/2016/5/13/chartex" xmlns:cx8="http://schemas.microsoft.com/office/drawing/2016/5/14/chartex" xmlns:mc="http://schemas.openxmlformats.org/markup-compatibility/2006" xmlns:m="http://schemas.openxmlformats.org/officeDocument/2006/math" xmlns:aink="http://schemas.microsoft.com/office/drawing/2016/ink" xmlns:am3d="http://schemas.microsoft.com/office/drawing/2017/model3d" xmlns:oel="http://schemas.microsoft.com/office/2019/extlst" xmlns:r="http://schemas.openxmlformats.org/officeDocument/2006/relationships" xmlns:wp14="http://schemas.microsoft.com/office/word/2010/wordprocessingDrawing" xmlns:wp="http://schemas.openxmlformats.org/drawingml/2006/wordprocessingDrawing" xmlns:wpg="http://schemas.microsoft.com/office/word/2010/wordprocessingGroup" xmlns:wpi="http://schemas.microsoft.com/office/word/2010/wordprocessingInk" xmlns:wps="http://schemas.microsoft.com/office/word/2010/wordprocessingShape" xmlns:o="urn:schemas-microsoft-com:office:office" xmlns:v="urn:schemas-microsoft-com:vml" xmlns:w10="urn:schemas-microsoft-com:office:word" xmlns:w="http://schemas.openxmlformats.org/wordprocessingml/2006/main" xmlns:w14="http://schemas.microsoft.com/office/word/2010/wordml" xmlns:w15="http://schemas.microsoft.com/office/word/2012/wordml" xmlns:w16cei="http://schemas.microsoft.com/office/word/2026/wordml/cei" xmlns:w16cex="http://schemas.microsoft.com/office/word/2018/wordml/cex" xmlns:w16cid="http://schemas.microsoft.com/office/word/2016/wordml/cid" xmlns:w16="http://schemas.microsoft.com/office/word/2018/wordml" xmlns:w16sdtdh="http://schemas.microsoft.com/office/word/2020/wordml/sdtdatahash" xmlns:w16sdtfl="http://schemas.microsoft.com/office/word/2024/wordml/sdtformatlock" xmlns:w16se="http://schemas.microsoft.com/office/word/2015/wordml/symex" xmlns:w16du="http://schemas.microsoft.com/office/word/2023/wordml/word16du" xmlns:wne="http://schemas.microsoft.com/office/word/2006/wordml" mc:Ignorable="w14 w15 w16se w16cid w16 w16cex w16sdtdh w16sdtfl w16du wp14">
   <w:body>
     <w:p>
       <w:pPr>
@@ -186,73 +186,7 @@
           <w:szCs w:val="24"/>
           <w:lang w:val="x-none" w:eastAsia="x-none"/>
         </w:rPr>
-        <w:t xml:space="preserve">본 주주간계약(이하 "본 계약")은 다음 당사자들 사이에 </w:t>
-      </w:r>
-      <w:proofErr w:type="gramStart"/>
-      <w:r>
-        <w:rPr>
-          <w:rFonts w:asciiTheme="minorEastAsia" w:eastAsiaTheme="minorEastAsia" w:hAnsiTheme="minorEastAsia" w:cs="Times New Roman"/>
-          <w:spacing w:val="-10"/>
-          <w:sz w:val="24"/>
-          <w:szCs w:val="24"/>
-          <w:lang w:val="x-none" w:eastAsia="x-none"/>
-        </w:rPr>
-        <w:t xml:space="preserve">20[  </w:t>
-      </w:r>
-      <w:proofErr w:type="gramEnd"/>
-      <w:r>
-        <w:rPr>
-          <w:rFonts w:asciiTheme="minorEastAsia" w:eastAsiaTheme="minorEastAsia" w:hAnsiTheme="minorEastAsia" w:cs="Times New Roman"/>
-          <w:spacing w:val="-10"/>
-          <w:sz w:val="24"/>
-          <w:szCs w:val="24"/>
-          <w:lang w:val="x-none" w:eastAsia="x-none"/>
-        </w:rPr>
-        <w:t xml:space="preserve">]년 </w:t>
-      </w:r>
-      <w:proofErr w:type="gramStart"/>
-      <w:r>
-        <w:rPr>
-          <w:rFonts w:asciiTheme="minorEastAsia" w:eastAsiaTheme="minorEastAsia" w:hAnsiTheme="minorEastAsia" w:cs="Times New Roman"/>
-          <w:spacing w:val="-10"/>
-          <w:sz w:val="24"/>
-          <w:szCs w:val="24"/>
-          <w:lang w:val="x-none" w:eastAsia="x-none"/>
-        </w:rPr>
-        <w:t>[  ]</w:t>
-      </w:r>
-      <w:proofErr w:type="gramEnd"/>
-      <w:r>
-        <w:rPr>
-          <w:rFonts w:asciiTheme="minorEastAsia" w:eastAsiaTheme="minorEastAsia" w:hAnsiTheme="minorEastAsia" w:cs="Times New Roman"/>
-          <w:spacing w:val="-10"/>
-          <w:sz w:val="24"/>
-          <w:szCs w:val="24"/>
-          <w:lang w:val="x-none" w:eastAsia="x-none"/>
-        </w:rPr>
-        <w:t xml:space="preserve">월 </w:t>
-      </w:r>
-      <w:proofErr w:type="gramStart"/>
-      <w:r>
-        <w:rPr>
-          <w:rFonts w:asciiTheme="minorEastAsia" w:eastAsiaTheme="minorEastAsia" w:hAnsiTheme="minorEastAsia" w:cs="Times New Roman"/>
-          <w:spacing w:val="-10"/>
-          <w:sz w:val="24"/>
-          <w:szCs w:val="24"/>
-          <w:lang w:val="x-none" w:eastAsia="x-none"/>
-        </w:rPr>
-        <w:t>[  ]</w:t>
-      </w:r>
-      <w:proofErr w:type="gramEnd"/>
-      <w:r>
-        <w:rPr>
-          <w:rFonts w:asciiTheme="minorEastAsia" w:eastAsiaTheme="minorEastAsia" w:hAnsiTheme="minorEastAsia" w:cs="Times New Roman"/>
-          <w:spacing w:val="-10"/>
-          <w:sz w:val="24"/>
-          <w:szCs w:val="24"/>
-          <w:lang w:val="x-none" w:eastAsia="x-none"/>
-        </w:rPr>
-        <w:t>일(이하 "체결일")로 체결되었다.</w:t>
+        <w:t>본 주주간계약(이하 "본 계약")은 다음 당사자들 사이에 20[  ]년 [  ]월 [  ]일(이하 "체결일")로 체결되었다.</w:t>
       </w:r>
     </w:p>
     <w:tbl>
@@ -279,12 +213,6 @@
         <w:gridCol w:w="2340"/>
       </w:tblGrid>
       <w:tr>
-        <w:tblPrEx>
-          <w:tblCellMar>
-            <w:top w:w="0" w:type="dxa"/>
-            <w:bottom w:w="0" w:type="dxa"/>
-          </w:tblCellMar>
-        </w:tblPrEx>
         <w:tc>
           <w:tcPr>
             <w:tcW w:w="2340" w:type="dxa"/>
@@ -407,12 +335,6 @@
         </w:tc>
       </w:tr>
       <w:tr>
-        <w:tblPrEx>
-          <w:tblCellMar>
-            <w:top w:w="0" w:type="dxa"/>
-            <w:bottom w:w="0" w:type="dxa"/>
-          </w:tblCellMar>
-        </w:tblPrEx>
         <w:tc>
           <w:tcPr>
             <w:tcW w:w="2340" w:type="dxa"/>
@@ -515,12 +437,6 @@
         </w:tc>
       </w:tr>
       <w:tr>
-        <w:tblPrEx>
-          <w:tblCellMar>
-            <w:top w:w="0" w:type="dxa"/>
-            <w:bottom w:w="0" w:type="dxa"/>
-          </w:tblCellMar>
-        </w:tblPrEx>
         <w:tc>
           <w:tcPr>
             <w:tcW w:w="2340" w:type="dxa"/>
@@ -623,12 +539,6 @@
         </w:tc>
       </w:tr>
       <w:tr>
-        <w:tblPrEx>
-          <w:tblCellMar>
-            <w:top w:w="0" w:type="dxa"/>
-            <w:bottom w:w="0" w:type="dxa"/>
-          </w:tblCellMar>
-        </w:tblPrEx>
         <w:tc>
           <w:tcPr>
             <w:tcW w:w="2340" w:type="dxa"/>
@@ -734,12 +644,21 @@
           <w:szCs w:val="24"/>
         </w:rPr>
       </w:pPr>
-      <w:r>
-        <w:rPr>
-          <w:rFonts w:asciiTheme="minorEastAsia" w:eastAsiaTheme="minorEastAsia" w:hAnsiTheme="minorEastAsia"/>
-          <w:szCs w:val="24"/>
-        </w:rPr>
-        <w:t xml:space="preserve">주식회사 </w:t>
+      <w:proofErr w:type="spellStart"/>
+      <w:r>
+        <w:rPr>
+          <w:rFonts w:asciiTheme="minorEastAsia" w:eastAsiaTheme="minorEastAsia" w:hAnsiTheme="minorEastAsia"/>
+          <w:szCs w:val="24"/>
+        </w:rPr>
+        <w:t>주식회사</w:t>
+      </w:r>
+      <w:proofErr w:type="spellEnd"/>
+      <w:r>
+        <w:rPr>
+          <w:rFonts w:asciiTheme="minorEastAsia" w:eastAsiaTheme="minorEastAsia" w:hAnsiTheme="minorEastAsia"/>
+          <w:szCs w:val="24"/>
+        </w:rPr>
+        <w:t xml:space="preserve"> </w:t>
       </w:r>
       <w:proofErr w:type="spellStart"/>
       <w:r>
@@ -755,7 +674,119 @@
           <w:rFonts w:asciiTheme="minorEastAsia" w:eastAsiaTheme="minorEastAsia" w:hAnsiTheme="minorEastAsia"/>
           <w:szCs w:val="24"/>
         </w:rPr>
-        <w:t xml:space="preserve">(이하 "회사"라 한다)의 주주(회사가 성립되기 전에는 주주가 될 발기인이나 동업자를 포함한다) </w:t>
+        <w:t>(</w:t>
+      </w:r>
+      <w:proofErr w:type="spellStart"/>
+      <w:r>
+        <w:rPr>
+          <w:rFonts w:asciiTheme="minorEastAsia" w:eastAsiaTheme="minorEastAsia" w:hAnsiTheme="minorEastAsia"/>
+          <w:szCs w:val="24"/>
+        </w:rPr>
+        <w:t>이하</w:t>
+      </w:r>
+      <w:proofErr w:type="spellEnd"/>
+      <w:r>
+        <w:rPr>
+          <w:rFonts w:asciiTheme="minorEastAsia" w:eastAsiaTheme="minorEastAsia" w:hAnsiTheme="minorEastAsia"/>
+          <w:szCs w:val="24"/>
+        </w:rPr>
+        <w:t xml:space="preserve"> "</w:t>
+      </w:r>
+      <w:proofErr w:type="spellStart"/>
+      <w:r>
+        <w:rPr>
+          <w:rFonts w:asciiTheme="minorEastAsia" w:eastAsiaTheme="minorEastAsia" w:hAnsiTheme="minorEastAsia"/>
+          <w:szCs w:val="24"/>
+        </w:rPr>
+        <w:t>회사"라</w:t>
+      </w:r>
+      <w:proofErr w:type="spellEnd"/>
+      <w:r>
+        <w:rPr>
+          <w:rFonts w:asciiTheme="minorEastAsia" w:eastAsiaTheme="minorEastAsia" w:hAnsiTheme="minorEastAsia"/>
+          <w:szCs w:val="24"/>
+        </w:rPr>
+        <w:t xml:space="preserve"> </w:t>
+      </w:r>
+      <w:proofErr w:type="spellStart"/>
+      <w:r>
+        <w:rPr>
+          <w:rFonts w:asciiTheme="minorEastAsia" w:eastAsiaTheme="minorEastAsia" w:hAnsiTheme="minorEastAsia"/>
+          <w:szCs w:val="24"/>
+        </w:rPr>
+        <w:t>한다</w:t>
+      </w:r>
+      <w:proofErr w:type="spellEnd"/>
+      <w:r>
+        <w:rPr>
+          <w:rFonts w:asciiTheme="minorEastAsia" w:eastAsiaTheme="minorEastAsia" w:hAnsiTheme="minorEastAsia"/>
+          <w:szCs w:val="24"/>
+        </w:rPr>
+        <w:t xml:space="preserve">)의 </w:t>
+      </w:r>
+      <w:proofErr w:type="spellStart"/>
+      <w:r>
+        <w:rPr>
+          <w:rFonts w:asciiTheme="minorEastAsia" w:eastAsiaTheme="minorEastAsia" w:hAnsiTheme="minorEastAsia"/>
+          <w:szCs w:val="24"/>
+        </w:rPr>
+        <w:t>주주</w:t>
+      </w:r>
+      <w:proofErr w:type="spellEnd"/>
+      <w:r>
+        <w:rPr>
+          <w:rFonts w:asciiTheme="minorEastAsia" w:eastAsiaTheme="minorEastAsia" w:hAnsiTheme="minorEastAsia"/>
+          <w:szCs w:val="24"/>
+        </w:rPr>
+        <w:t>(</w:t>
+      </w:r>
+      <w:proofErr w:type="spellStart"/>
+      <w:r>
+        <w:rPr>
+          <w:rFonts w:asciiTheme="minorEastAsia" w:eastAsiaTheme="minorEastAsia" w:hAnsiTheme="minorEastAsia"/>
+          <w:szCs w:val="24"/>
+        </w:rPr>
+        <w:t>회사가</w:t>
+      </w:r>
+      <w:proofErr w:type="spellEnd"/>
+      <w:r>
+        <w:rPr>
+          <w:rFonts w:asciiTheme="minorEastAsia" w:eastAsiaTheme="minorEastAsia" w:hAnsiTheme="minorEastAsia"/>
+          <w:szCs w:val="24"/>
+        </w:rPr>
+        <w:t xml:space="preserve"> 성립되기 전에는 주주가 될 발기인이나 </w:t>
+      </w:r>
+      <w:proofErr w:type="spellStart"/>
+      <w:r>
+        <w:rPr>
+          <w:rFonts w:asciiTheme="minorEastAsia" w:eastAsiaTheme="minorEastAsia" w:hAnsiTheme="minorEastAsia"/>
+          <w:szCs w:val="24"/>
+        </w:rPr>
+        <w:t>동업자를</w:t>
+      </w:r>
+      <w:proofErr w:type="spellEnd"/>
+      <w:r>
+        <w:rPr>
+          <w:rFonts w:asciiTheme="minorEastAsia" w:eastAsiaTheme="minorEastAsia" w:hAnsiTheme="minorEastAsia"/>
+          <w:szCs w:val="24"/>
+        </w:rPr>
+        <w:t xml:space="preserve"> </w:t>
+      </w:r>
+      <w:proofErr w:type="spellStart"/>
+      <w:r>
+        <w:rPr>
+          <w:rFonts w:asciiTheme="minorEastAsia" w:eastAsiaTheme="minorEastAsia" w:hAnsiTheme="minorEastAsia"/>
+          <w:szCs w:val="24"/>
+        </w:rPr>
+        <w:t>포함한다</w:t>
+      </w:r>
+      <w:proofErr w:type="spellEnd"/>
+      <w:r>
+        <w:rPr>
+          <w:rFonts w:asciiTheme="minorEastAsia" w:eastAsiaTheme="minorEastAsia" w:hAnsiTheme="minorEastAsia"/>
+          <w:szCs w:val="24"/>
+        </w:rPr>
+        <w:t xml:space="preserve">) </w:t>
       </w:r>
       <w:proofErr w:type="spellStart"/>
       <w:r>
@@ -803,7 +834,39 @@
           <w:rFonts w:asciiTheme="minorEastAsia" w:eastAsiaTheme="minorEastAsia" w:hAnsiTheme="minorEastAsia"/>
           <w:szCs w:val="24"/>
         </w:rPr>
-        <w:t>(이하 "주주" 또는 "주주들"이라고 한다)는 회사의 경영 및 주주의 지위 등에 관하여 다음과 같이 계약을 체결한다.</w:t>
+        <w:t>(</w:t>
+      </w:r>
+      <w:proofErr w:type="spellStart"/>
+      <w:r>
+        <w:rPr>
+          <w:rFonts w:asciiTheme="minorEastAsia" w:eastAsiaTheme="minorEastAsia" w:hAnsiTheme="minorEastAsia"/>
+          <w:szCs w:val="24"/>
+        </w:rPr>
+        <w:t>이하</w:t>
+      </w:r>
+      <w:proofErr w:type="spellEnd"/>
+      <w:r>
+        <w:rPr>
+          <w:rFonts w:asciiTheme="minorEastAsia" w:eastAsiaTheme="minorEastAsia" w:hAnsiTheme="minorEastAsia"/>
+          <w:szCs w:val="24"/>
+        </w:rPr>
+        <w:t xml:space="preserve"> "</w:t>
+      </w:r>
+      <w:proofErr w:type="spellStart"/>
+      <w:r>
+        <w:rPr>
+          <w:rFonts w:asciiTheme="minorEastAsia" w:eastAsiaTheme="minorEastAsia" w:hAnsiTheme="minorEastAsia"/>
+          <w:szCs w:val="24"/>
+        </w:rPr>
+        <w:t>주주</w:t>
+      </w:r>
+      <w:proofErr w:type="spellEnd"/>
+      <w:r>
+        <w:rPr>
+          <w:rFonts w:asciiTheme="minorEastAsia" w:eastAsiaTheme="minorEastAsia" w:hAnsiTheme="minorEastAsia"/>
+          <w:szCs w:val="24"/>
+        </w:rPr>
+        <w:t>" 또는 "주주들"이라고 한다)는 회사의 경영 및 주주의 지위 등에 관하여 다음과 같이 계약을 체결한다.</w:t>
       </w:r>
     </w:p>
     <w:p>
@@ -1534,7 +1597,7 @@
       <w:pPr>
         <w:pStyle w:val="11"/>
         <w:rPr>
-          <w:rFonts w:asciiTheme="minorEastAsia" w:eastAsiaTheme="minorEastAsia" w:hAnsiTheme="minorEastAsia" w:hint="eastAsia"/>
+          <w:rFonts w:asciiTheme="minorEastAsia" w:eastAsiaTheme="minorEastAsia" w:hAnsiTheme="minorEastAsia"/>
           <w:szCs w:val="24"/>
         </w:rPr>
       </w:pPr>
@@ -1600,13 +1663,6 @@
           <w:szCs w:val="24"/>
         </w:rPr>
         <w:t xml:space="preserve"> 사항에 관하여는 주주들 전원의 합의로 결정하고, 주주총회 또는 이사회 결의가 필요한 경우 주주들의 합의에 따라 의결권을 행사하여야 한다.  </w:t>
-      </w:r>
-      <w:r>
-        <w:rPr>
-          <w:rFonts w:asciiTheme="minorEastAsia" w:eastAsiaTheme="minorEastAsia" w:hAnsiTheme="minorEastAsia" w:hint="eastAsia"/>
-          <w:szCs w:val="24"/>
-        </w:rPr>
-        <w:t>\</w:t>
       </w:r>
     </w:p>
     <w:p>
@@ -1640,8 +1696,17 @@
           <w:rFonts w:asciiTheme="minorEastAsia" w:eastAsiaTheme="minorEastAsia" w:hAnsiTheme="minorEastAsia"/>
           <w:szCs w:val="24"/>
         </w:rPr>
-        <w:t xml:space="preserve"> 변경</w:t>
-      </w:r>
+        <w:t xml:space="preserve"> </w:t>
+      </w:r>
+      <w:proofErr w:type="spellStart"/>
+      <w:r>
+        <w:rPr>
+          <w:rFonts w:asciiTheme="minorEastAsia" w:eastAsiaTheme="minorEastAsia" w:hAnsiTheme="minorEastAsia"/>
+          <w:szCs w:val="24"/>
+        </w:rPr>
+        <w:t>변경</w:t>
+      </w:r>
+      <w:proofErr w:type="spellEnd"/>
     </w:p>
     <w:p>
       <w:pPr>
@@ -1706,7 +1771,39 @@
           <w:rFonts w:asciiTheme="minorEastAsia" w:eastAsiaTheme="minorEastAsia" w:hAnsiTheme="minorEastAsia"/>
           <w:szCs w:val="24"/>
         </w:rPr>
-        <w:t xml:space="preserve"> 발행, 주식매수선택권 부여 등 자본금의 증감을 </w:t>
+        <w:t xml:space="preserve"> 발행, 주식매수선택권 부여 등 </w:t>
+      </w:r>
+      <w:proofErr w:type="spellStart"/>
+      <w:r>
+        <w:rPr>
+          <w:rFonts w:asciiTheme="minorEastAsia" w:eastAsiaTheme="minorEastAsia" w:hAnsiTheme="minorEastAsia"/>
+          <w:szCs w:val="24"/>
+        </w:rPr>
+        <w:t>자본금의</w:t>
+      </w:r>
+      <w:proofErr w:type="spellEnd"/>
+      <w:r>
+        <w:rPr>
+          <w:rFonts w:asciiTheme="minorEastAsia" w:eastAsiaTheme="minorEastAsia" w:hAnsiTheme="minorEastAsia"/>
+          <w:szCs w:val="24"/>
+        </w:rPr>
+        <w:t xml:space="preserve"> </w:t>
+      </w:r>
+      <w:proofErr w:type="spellStart"/>
+      <w:r>
+        <w:rPr>
+          <w:rFonts w:asciiTheme="minorEastAsia" w:eastAsiaTheme="minorEastAsia" w:hAnsiTheme="minorEastAsia"/>
+          <w:szCs w:val="24"/>
+        </w:rPr>
+        <w:t>증감을</w:t>
+      </w:r>
+      <w:proofErr w:type="spellEnd"/>
+      <w:r>
+        <w:rPr>
+          <w:rFonts w:asciiTheme="minorEastAsia" w:eastAsiaTheme="minorEastAsia" w:hAnsiTheme="minorEastAsia"/>
+          <w:szCs w:val="24"/>
+        </w:rPr>
+        <w:t xml:space="preserve"> </w:t>
       </w:r>
       <w:proofErr w:type="spellStart"/>
       <w:r>
@@ -1739,8 +1836,17 @@
           <w:rFonts w:asciiTheme="minorEastAsia" w:eastAsiaTheme="minorEastAsia" w:hAnsiTheme="minorEastAsia"/>
           <w:szCs w:val="24"/>
         </w:rPr>
-        <w:t xml:space="preserve"> 행위</w:t>
-      </w:r>
+        <w:t xml:space="preserve"> </w:t>
+      </w:r>
+      <w:proofErr w:type="spellStart"/>
+      <w:r>
+        <w:rPr>
+          <w:rFonts w:asciiTheme="minorEastAsia" w:eastAsiaTheme="minorEastAsia" w:hAnsiTheme="minorEastAsia"/>
+          <w:szCs w:val="24"/>
+        </w:rPr>
+        <w:t>행위</w:t>
+      </w:r>
+      <w:proofErr w:type="spellEnd"/>
     </w:p>
     <w:p>
       <w:pPr>
@@ -1773,8 +1879,17 @@
           <w:rFonts w:asciiTheme="minorEastAsia" w:eastAsiaTheme="minorEastAsia" w:hAnsiTheme="minorEastAsia"/>
           <w:szCs w:val="24"/>
         </w:rPr>
-        <w:t xml:space="preserve"> 결정</w:t>
-      </w:r>
+        <w:t xml:space="preserve"> </w:t>
+      </w:r>
+      <w:proofErr w:type="spellStart"/>
+      <w:r>
+        <w:rPr>
+          <w:rFonts w:asciiTheme="minorEastAsia" w:eastAsiaTheme="minorEastAsia" w:hAnsiTheme="minorEastAsia"/>
+          <w:szCs w:val="24"/>
+        </w:rPr>
+        <w:t>결정</w:t>
+      </w:r>
+      <w:proofErr w:type="spellEnd"/>
     </w:p>
     <w:p>
       <w:pPr>
@@ -1962,7 +2077,39 @@
           <w:rFonts w:asciiTheme="minorEastAsia" w:eastAsiaTheme="minorEastAsia" w:hAnsiTheme="minorEastAsia"/>
           <w:szCs w:val="24"/>
         </w:rPr>
-        <w:t xml:space="preserve">, 사업양수도, 합병, 분할, 분할합병, 주식의 포괄적 교환 또는 이전, 영업의 양도·양수, 위탁경영 </w:t>
+        <w:t>, 사업양수도, 합병, 분할, 분할합병, 주식의 포괄적 교환 또는 이전, 영업의 양</w:t>
+      </w:r>
+      <w:proofErr w:type="spellStart"/>
+      <w:r>
+        <w:rPr>
+          <w:rFonts w:asciiTheme="minorEastAsia" w:eastAsiaTheme="minorEastAsia" w:hAnsiTheme="minorEastAsia"/>
+          <w:szCs w:val="24"/>
+        </w:rPr>
+        <w:t>도·양수</w:t>
+      </w:r>
+      <w:proofErr w:type="spellEnd"/>
+      <w:r>
+        <w:rPr>
+          <w:rFonts w:asciiTheme="minorEastAsia" w:eastAsiaTheme="minorEastAsia" w:hAnsiTheme="minorEastAsia"/>
+          <w:szCs w:val="24"/>
+        </w:rPr>
+        <w:t xml:space="preserve">, </w:t>
+      </w:r>
+      <w:proofErr w:type="spellStart"/>
+      <w:r>
+        <w:rPr>
+          <w:rFonts w:asciiTheme="minorEastAsia" w:eastAsiaTheme="minorEastAsia" w:hAnsiTheme="minorEastAsia"/>
+          <w:szCs w:val="24"/>
+        </w:rPr>
+        <w:t>위탁경영</w:t>
+      </w:r>
+      <w:proofErr w:type="spellEnd"/>
+      <w:r>
+        <w:rPr>
+          <w:rFonts w:asciiTheme="minorEastAsia" w:eastAsiaTheme="minorEastAsia" w:hAnsiTheme="minorEastAsia"/>
+          <w:szCs w:val="24"/>
+        </w:rPr>
+        <w:t xml:space="preserve"> </w:t>
       </w:r>
       <w:proofErr w:type="spellStart"/>
       <w:r>
@@ -2010,8 +2157,17 @@
           <w:rFonts w:asciiTheme="minorEastAsia" w:eastAsiaTheme="minorEastAsia" w:hAnsiTheme="minorEastAsia"/>
           <w:szCs w:val="24"/>
         </w:rPr>
-        <w:t xml:space="preserve"> 변경</w:t>
-      </w:r>
+        <w:t xml:space="preserve"> </w:t>
+      </w:r>
+      <w:proofErr w:type="spellStart"/>
+      <w:r>
+        <w:rPr>
+          <w:rFonts w:asciiTheme="minorEastAsia" w:eastAsiaTheme="minorEastAsia" w:hAnsiTheme="minorEastAsia"/>
+          <w:szCs w:val="24"/>
+        </w:rPr>
+        <w:t>변경</w:t>
+      </w:r>
+      <w:proofErr w:type="spellEnd"/>
     </w:p>
     <w:p>
       <w:pPr>
@@ -2076,7 +2232,23 @@
           <w:rFonts w:asciiTheme="minorEastAsia" w:eastAsiaTheme="minorEastAsia" w:hAnsiTheme="minorEastAsia"/>
           <w:szCs w:val="24"/>
         </w:rPr>
-        <w:t xml:space="preserve"> 및 이들의 </w:t>
+        <w:t xml:space="preserve"> 및 </w:t>
+      </w:r>
+      <w:proofErr w:type="spellStart"/>
+      <w:r>
+        <w:rPr>
+          <w:rFonts w:asciiTheme="minorEastAsia" w:eastAsiaTheme="minorEastAsia" w:hAnsiTheme="minorEastAsia"/>
+          <w:szCs w:val="24"/>
+        </w:rPr>
+        <w:t>이들의</w:t>
+      </w:r>
+      <w:proofErr w:type="spellEnd"/>
+      <w:r>
+        <w:rPr>
+          <w:rFonts w:asciiTheme="minorEastAsia" w:eastAsiaTheme="minorEastAsia" w:hAnsiTheme="minorEastAsia"/>
+          <w:szCs w:val="24"/>
+        </w:rPr>
+        <w:t xml:space="preserve"> </w:t>
       </w:r>
       <w:proofErr w:type="spellStart"/>
       <w:r>
@@ -2182,7 +2354,23 @@
           <w:rFonts w:asciiTheme="minorEastAsia" w:eastAsiaTheme="minorEastAsia" w:hAnsiTheme="minorEastAsia"/>
           <w:szCs w:val="24"/>
         </w:rPr>
-        <w:t xml:space="preserve"> 초과하여 투자하는 행위</w:t>
+        <w:t xml:space="preserve"> </w:t>
+      </w:r>
+      <w:proofErr w:type="spellStart"/>
+      <w:r>
+        <w:rPr>
+          <w:rFonts w:asciiTheme="minorEastAsia" w:eastAsiaTheme="minorEastAsia" w:hAnsiTheme="minorEastAsia"/>
+          <w:szCs w:val="24"/>
+        </w:rPr>
+        <w:t>초과하여</w:t>
+      </w:r>
+      <w:proofErr w:type="spellEnd"/>
+      <w:r>
+        <w:rPr>
+          <w:rFonts w:asciiTheme="minorEastAsia" w:eastAsiaTheme="minorEastAsia" w:hAnsiTheme="minorEastAsia"/>
+          <w:szCs w:val="24"/>
+        </w:rPr>
+        <w:t xml:space="preserve"> 투자하는 행위</w:t>
       </w:r>
     </w:p>
     <w:p>
@@ -2254,7 +2442,55 @@
           <w:rFonts w:asciiTheme="minorEastAsia" w:eastAsiaTheme="minorEastAsia" w:hAnsiTheme="minorEastAsia"/>
           <w:szCs w:val="24"/>
         </w:rPr>
-        <w:t xml:space="preserve"> 사항에 관하여는 다른 주주에게 사전에 </w:t>
+        <w:t xml:space="preserve"> 사항에 관하여는 </w:t>
+      </w:r>
+      <w:proofErr w:type="spellStart"/>
+      <w:r>
+        <w:rPr>
+          <w:rFonts w:asciiTheme="minorEastAsia" w:eastAsiaTheme="minorEastAsia" w:hAnsiTheme="minorEastAsia"/>
+          <w:szCs w:val="24"/>
+        </w:rPr>
+        <w:t>다른</w:t>
+      </w:r>
+      <w:proofErr w:type="spellEnd"/>
+      <w:r>
+        <w:rPr>
+          <w:rFonts w:asciiTheme="minorEastAsia" w:eastAsiaTheme="minorEastAsia" w:hAnsiTheme="minorEastAsia"/>
+          <w:szCs w:val="24"/>
+        </w:rPr>
+        <w:t xml:space="preserve"> </w:t>
+      </w:r>
+      <w:proofErr w:type="spellStart"/>
+      <w:r>
+        <w:rPr>
+          <w:rFonts w:asciiTheme="minorEastAsia" w:eastAsiaTheme="minorEastAsia" w:hAnsiTheme="minorEastAsia"/>
+          <w:szCs w:val="24"/>
+        </w:rPr>
+        <w:t>주주에게</w:t>
+      </w:r>
+      <w:proofErr w:type="spellEnd"/>
+      <w:r>
+        <w:rPr>
+          <w:rFonts w:asciiTheme="minorEastAsia" w:eastAsiaTheme="minorEastAsia" w:hAnsiTheme="minorEastAsia"/>
+          <w:szCs w:val="24"/>
+        </w:rPr>
+        <w:t xml:space="preserve"> </w:t>
+      </w:r>
+      <w:proofErr w:type="spellStart"/>
+      <w:r>
+        <w:rPr>
+          <w:rFonts w:asciiTheme="minorEastAsia" w:eastAsiaTheme="minorEastAsia" w:hAnsiTheme="minorEastAsia"/>
+          <w:szCs w:val="24"/>
+        </w:rPr>
+        <w:t>사전에</w:t>
+      </w:r>
+      <w:proofErr w:type="spellEnd"/>
+      <w:r>
+        <w:rPr>
+          <w:rFonts w:asciiTheme="minorEastAsia" w:eastAsiaTheme="minorEastAsia" w:hAnsiTheme="minorEastAsia"/>
+          <w:szCs w:val="24"/>
+        </w:rPr>
+        <w:t xml:space="preserve"> </w:t>
       </w:r>
       <w:proofErr w:type="spellStart"/>
       <w:r>
@@ -2336,7 +2572,23 @@
           <w:rFonts w:asciiTheme="minorEastAsia" w:eastAsiaTheme="minorEastAsia" w:hAnsiTheme="minorEastAsia"/>
           <w:szCs w:val="24"/>
         </w:rPr>
-        <w:t xml:space="preserve">1. 이사회 및 </w:t>
+        <w:t xml:space="preserve">1. </w:t>
+      </w:r>
+      <w:proofErr w:type="spellStart"/>
+      <w:r>
+        <w:rPr>
+          <w:rFonts w:asciiTheme="minorEastAsia" w:eastAsiaTheme="minorEastAsia" w:hAnsiTheme="minorEastAsia"/>
+          <w:szCs w:val="24"/>
+        </w:rPr>
+        <w:t>이사회</w:t>
+      </w:r>
+      <w:proofErr w:type="spellEnd"/>
+      <w:r>
+        <w:rPr>
+          <w:rFonts w:asciiTheme="minorEastAsia" w:eastAsiaTheme="minorEastAsia" w:hAnsiTheme="minorEastAsia"/>
+          <w:szCs w:val="24"/>
+        </w:rPr>
+        <w:t xml:space="preserve"> 및 </w:t>
       </w:r>
       <w:proofErr w:type="spellStart"/>
       <w:r>
@@ -2368,8 +2620,17 @@
           <w:rFonts w:asciiTheme="minorEastAsia" w:eastAsiaTheme="minorEastAsia" w:hAnsiTheme="minorEastAsia"/>
           <w:szCs w:val="24"/>
         </w:rPr>
-        <w:t xml:space="preserve"> 사항</w:t>
-      </w:r>
+        <w:t xml:space="preserve"> </w:t>
+      </w:r>
+      <w:proofErr w:type="spellStart"/>
+      <w:r>
+        <w:rPr>
+          <w:rFonts w:asciiTheme="minorEastAsia" w:eastAsiaTheme="minorEastAsia" w:hAnsiTheme="minorEastAsia"/>
+          <w:szCs w:val="24"/>
+        </w:rPr>
+        <w:t>사항</w:t>
+      </w:r>
+      <w:proofErr w:type="spellEnd"/>
     </w:p>
     <w:p>
       <w:pPr>
@@ -2508,14 +2769,30 @@
           <w:rFonts w:asciiTheme="minorEastAsia" w:eastAsiaTheme="minorEastAsia" w:hAnsiTheme="minorEastAsia"/>
           <w:szCs w:val="24"/>
         </w:rPr>
-        <w:t xml:space="preserve"> 중대한 영향을 미치는 사항</w:t>
+        <w:t xml:space="preserve"> </w:t>
+      </w:r>
+      <w:proofErr w:type="spellStart"/>
+      <w:r>
+        <w:rPr>
+          <w:rFonts w:asciiTheme="minorEastAsia" w:eastAsiaTheme="minorEastAsia" w:hAnsiTheme="minorEastAsia"/>
+          <w:szCs w:val="24"/>
+        </w:rPr>
+        <w:t>중대한</w:t>
+      </w:r>
+      <w:proofErr w:type="spellEnd"/>
+      <w:r>
+        <w:rPr>
+          <w:rFonts w:asciiTheme="minorEastAsia" w:eastAsiaTheme="minorEastAsia" w:hAnsiTheme="minorEastAsia"/>
+          <w:szCs w:val="24"/>
+        </w:rPr>
+        <w:t xml:space="preserve"> 영향을 미치는 사항</w:t>
       </w:r>
     </w:p>
     <w:p>
       <w:pPr>
         <w:pStyle w:val="11"/>
         <w:rPr>
-          <w:rFonts w:asciiTheme="minorEastAsia" w:eastAsiaTheme="minorEastAsia" w:hAnsiTheme="minorEastAsia" w:hint="eastAsia"/>
+          <w:rFonts w:asciiTheme="minorEastAsia" w:eastAsiaTheme="minorEastAsia" w:hAnsiTheme="minorEastAsia"/>
           <w:szCs w:val="24"/>
         </w:rPr>
       </w:pPr>
@@ -3041,18 +3318,7 @@
           <w:sz w:val="24"/>
           <w:szCs w:val="24"/>
         </w:rPr>
-        <w:t>3</w:t>
-      </w:r>
-      <w:r>
-        <w:rPr>
-          <w:rFonts w:asciiTheme="minorEastAsia" w:eastAsiaTheme="minorEastAsia" w:hAnsiTheme="minorEastAsia" w:hint="eastAsia"/>
-          <w:b/>
-          <w:bCs/>
-          <w:color w:val="auto"/>
-          <w:sz w:val="24"/>
-          <w:szCs w:val="24"/>
-        </w:rPr>
-        <w:t>의 2조 (</w:t>
+        <w:t>3의 2조 (</w:t>
       </w:r>
       <w:r>
         <w:rPr>
@@ -3391,18 +3657,7 @@
           <w:sz w:val="24"/>
           <w:szCs w:val="24"/>
         </w:rPr>
-        <w:t>3의 3</w:t>
-      </w:r>
-      <w:r>
-        <w:rPr>
-          <w:rFonts w:asciiTheme="minorEastAsia" w:eastAsiaTheme="minorEastAsia" w:hAnsiTheme="minorEastAsia" w:hint="eastAsia"/>
-          <w:b/>
-          <w:bCs/>
-          <w:color w:val="auto"/>
-          <w:sz w:val="24"/>
-          <w:szCs w:val="24"/>
-        </w:rPr>
-        <w:t xml:space="preserve">조 </w:t>
+        <w:t xml:space="preserve">3의 3조 </w:t>
       </w:r>
       <w:r>
         <w:rPr>
@@ -6291,7 +6546,7 @@
       <w:pPr>
         <w:pStyle w:val="ad"/>
         <w:rPr>
-          <w:rFonts w:asciiTheme="minorEastAsia" w:eastAsiaTheme="minorEastAsia" w:hAnsiTheme="minorEastAsia" w:hint="eastAsia"/>
+          <w:rFonts w:asciiTheme="minorEastAsia" w:eastAsiaTheme="minorEastAsia" w:hAnsiTheme="minorEastAsia"/>
           <w:lang w:eastAsia="ko-KR"/>
         </w:rPr>
       </w:pPr>
@@ -6327,7 +6582,49 @@
         <w:rPr>
           <w:rFonts w:asciiTheme="minorEastAsia" w:eastAsiaTheme="minorEastAsia" w:hAnsiTheme="minorEastAsia"/>
         </w:rPr>
-        <w:t xml:space="preserve"> 3년 이내에 회사에서 퇴사하는 경우, 다른 주주는 퇴사하는 주주가 보유하고 있는 주식 전부 또는 일부를 퇴사일 당시의 각 지분율에 따라 퇴사하는 주주로부터 액면가로 매수할 수 </w:t>
+        <w:t xml:space="preserve"> 3년 </w:t>
+      </w:r>
+      <w:proofErr w:type="spellStart"/>
+      <w:r>
+        <w:rPr>
+          <w:rFonts w:asciiTheme="minorEastAsia" w:eastAsiaTheme="minorEastAsia" w:hAnsiTheme="minorEastAsia"/>
+        </w:rPr>
+        <w:t>이내에</w:t>
+      </w:r>
+      <w:proofErr w:type="spellEnd"/>
+      <w:r>
+        <w:rPr>
+          <w:rFonts w:asciiTheme="minorEastAsia" w:eastAsiaTheme="minorEastAsia" w:hAnsiTheme="minorEastAsia"/>
+        </w:rPr>
+        <w:t xml:space="preserve"> 회사에서 퇴사하는 경우, 다른 주주는 퇴사하는 주주가 보유하고 있는 주식 전부 또는 일부를 퇴사일 당시의 각 지분율에 따라 퇴사하는 주주로부터 </w:t>
+      </w:r>
+      <w:proofErr w:type="spellStart"/>
+      <w:r>
+        <w:rPr>
+          <w:rFonts w:asciiTheme="minorEastAsia" w:eastAsiaTheme="minorEastAsia" w:hAnsiTheme="minorEastAsia"/>
+        </w:rPr>
+        <w:t>액면가로</w:t>
+      </w:r>
+      <w:proofErr w:type="spellEnd"/>
+      <w:r>
+        <w:rPr>
+          <w:rFonts w:asciiTheme="minorEastAsia" w:eastAsiaTheme="minorEastAsia" w:hAnsiTheme="minorEastAsia"/>
+        </w:rPr>
+        <w:t xml:space="preserve"> </w:t>
+      </w:r>
+      <w:proofErr w:type="spellStart"/>
+      <w:r>
+        <w:rPr>
+          <w:rFonts w:asciiTheme="minorEastAsia" w:eastAsiaTheme="minorEastAsia" w:hAnsiTheme="minorEastAsia"/>
+        </w:rPr>
+        <w:t>매수할</w:t>
+      </w:r>
+      <w:proofErr w:type="spellEnd"/>
+      <w:r>
+        <w:rPr>
+          <w:rFonts w:asciiTheme="minorEastAsia" w:eastAsiaTheme="minorEastAsia" w:hAnsiTheme="minorEastAsia"/>
+        </w:rPr>
+        <w:t xml:space="preserve"> 수 </w:t>
       </w:r>
       <w:proofErr w:type="spellStart"/>
       <w:r>
@@ -6426,7 +6723,21 @@
         <w:rPr>
           <w:rFonts w:asciiTheme="minorEastAsia" w:eastAsiaTheme="minorEastAsia" w:hAnsiTheme="minorEastAsia"/>
         </w:rPr>
-        <w:t xml:space="preserve"> 퇴사자가 다른 주주 및 회사에 대하여 부담하는 위약금 등 손해배상의무에 영향을 미치지 아니한다.</w:t>
+        <w:t xml:space="preserve"> </w:t>
+      </w:r>
+      <w:proofErr w:type="spellStart"/>
+      <w:r>
+        <w:rPr>
+          <w:rFonts w:asciiTheme="minorEastAsia" w:eastAsiaTheme="minorEastAsia" w:hAnsiTheme="minorEastAsia"/>
+        </w:rPr>
+        <w:t>퇴사자가</w:t>
+      </w:r>
+      <w:proofErr w:type="spellEnd"/>
+      <w:r>
+        <w:rPr>
+          <w:rFonts w:asciiTheme="minorEastAsia" w:eastAsiaTheme="minorEastAsia" w:hAnsiTheme="minorEastAsia"/>
+        </w:rPr>
+        <w:t xml:space="preserve"> 다른 주주 및 회사에 대하여 부담하는 위약금 등 손해배상의무에 영향을 미치지 아니한다.</w:t>
       </w:r>
     </w:p>
     <w:p>
@@ -12266,7 +12577,7 @@
       <w:pPr>
         <w:pStyle w:val="1"/>
         <w:rPr>
-          <w:rFonts w:asciiTheme="minorEastAsia" w:eastAsiaTheme="minorEastAsia" w:hAnsiTheme="minorEastAsia" w:hint="eastAsia"/>
+          <w:rFonts w:asciiTheme="minorEastAsia" w:eastAsiaTheme="minorEastAsia" w:hAnsiTheme="minorEastAsia"/>
           <w:b/>
           <w:bCs/>
           <w:color w:val="auto"/>
@@ -12580,7 +12891,6 @@
           <w:sz w:val="24"/>
         </w:rPr>
       </w:pPr>
-      <w:proofErr w:type="gramStart"/>
       <w:r>
         <w:rPr>
           <w:rFonts w:asciiTheme="minorEastAsia" w:eastAsiaTheme="minorEastAsia" w:hAnsiTheme="minorEastAsia" w:hint="eastAsia"/>
@@ -12588,7 +12898,6 @@
         </w:rPr>
         <w:t>제 1</w:t>
       </w:r>
-      <w:proofErr w:type="gramEnd"/>
       <w:r>
         <w:rPr>
           <w:rFonts w:asciiTheme="minorEastAsia" w:eastAsiaTheme="minorEastAsia" w:hAnsiTheme="minorEastAsia"/>
@@ -12941,7 +13250,7 @@
     <w:p>
       <w:pPr>
         <w:rPr>
-          <w:rFonts w:asciiTheme="minorEastAsia" w:eastAsiaTheme="minorEastAsia" w:hAnsiTheme="minorEastAsia" w:hint="eastAsia"/>
+          <w:rFonts w:asciiTheme="minorEastAsia" w:eastAsiaTheme="minorEastAsia" w:hAnsiTheme="minorEastAsia"/>
           <w:color w:val="FF0000"/>
         </w:rPr>
       </w:pPr>
@@ -13115,37 +13424,21 @@
           <w:rFonts w:asciiTheme="minorEastAsia" w:eastAsiaTheme="minorEastAsia" w:hAnsiTheme="minorEastAsia" w:hint="eastAsia"/>
           <w:sz w:val="24"/>
         </w:rPr>
-        <w:t xml:space="preserve">계약 당사자들은 이상과 같이 본 계약을 체결하고 이를 증명하기 위하여 본 </w:t>
-      </w:r>
-      <w:proofErr w:type="gramStart"/>
-      <w:r>
-        <w:rPr>
-          <w:rFonts w:asciiTheme="minorEastAsia" w:eastAsiaTheme="minorEastAsia" w:hAnsiTheme="minorEastAsia" w:hint="eastAsia"/>
-          <w:sz w:val="24"/>
-        </w:rPr>
-        <w:t xml:space="preserve">계약서 </w:t>
-      </w:r>
-      <w:r>
-        <w:rPr>
-          <w:rFonts w:asciiTheme="minorEastAsia" w:eastAsiaTheme="minorEastAsia" w:hAnsiTheme="minorEastAsia"/>
-          <w:sz w:val="24"/>
-        </w:rPr>
-        <w:t xml:space="preserve"> </w:t>
-      </w:r>
-      <w:r>
-        <w:rPr>
-          <w:rFonts w:asciiTheme="minorEastAsia" w:eastAsiaTheme="minorEastAsia" w:hAnsiTheme="minorEastAsia" w:hint="eastAsia"/>
-          <w:sz w:val="24"/>
-        </w:rPr>
-        <w:t>부를</w:t>
-      </w:r>
-      <w:proofErr w:type="gramEnd"/>
-      <w:r>
-        <w:rPr>
-          <w:rFonts w:asciiTheme="minorEastAsia" w:eastAsiaTheme="minorEastAsia" w:hAnsiTheme="minorEastAsia" w:hint="eastAsia"/>
-          <w:sz w:val="24"/>
-        </w:rPr>
-        <w:t xml:space="preserve"> 작성하여 각각 서명 또는 기명 날인한 후 각 1부씩 보관한다.</w:t>
+        <w:t xml:space="preserve">계약 당사자들은 이상과 같이 본 계약을 체결하고 이를 증명하기 위하여 본 계약서 </w:t>
+      </w:r>
+      <w:r>
+        <w:rPr>
+          <w:rFonts w:asciiTheme="minorEastAsia" w:eastAsiaTheme="minorEastAsia" w:hAnsiTheme="minorEastAsia"/>
+          <w:sz w:val="24"/>
+        </w:rPr>
+        <w:t xml:space="preserve"> </w:t>
+      </w:r>
+      <w:r>
+        <w:rPr>
+          <w:rFonts w:asciiTheme="minorEastAsia" w:eastAsiaTheme="minorEastAsia" w:hAnsiTheme="minorEastAsia" w:hint="eastAsia"/>
+          <w:sz w:val="24"/>
+        </w:rPr>
+        <w:t>부를 작성하여 각각 서명 또는 기명 날인한 후 각 1부씩 보관한다.</w:t>
       </w:r>
     </w:p>
     <w:p>
@@ -13389,7 +13682,6 @@
     <w:p>
       <w:pPr>
         <w:rPr>
-          <w:rFonts w:hint="eastAsia"/>
           <w:sz w:val="24"/>
           <w:szCs w:val="24"/>
         </w:rPr>
@@ -13406,7 +13698,7 @@
 </file>
 
 <file path=word/endnotes.xml><?xml version="1.0" encoding="utf-8"?>
-<w:endnotes xmlns:wpc="http://schemas.microsoft.com/office/word/2010/wordprocessingCanvas" xmlns:cx="http://schemas.microsoft.com/office/drawing/2014/chartex" xmlns:cx1="http://schemas.microsoft.com/office/drawing/2015/9/8/chartex" xmlns:cx2="http://schemas.microsoft.com/office/drawing/2015/10/21/chartex" xmlns:cx3="http://schemas.microsoft.com/office/drawing/2016/5/9/chartex" xmlns:cx4="http://schemas.microsoft.com/office/drawing/2016/5/10/chartex" xmlns:cx5="http://schemas.microsoft.com/office/drawing/2016/5/11/chartex" xmlns:cx6="http://schemas.microsoft.com/office/drawing/2016/5/12/chartex" xmlns:cx7="http://schemas.microsoft.com/office/drawing/2016/5/13/chartex" xmlns:cx8="http://schemas.microsoft.com/office/drawing/2016/5/14/chartex" xmlns:mc="http://schemas.openxmlformats.org/markup-compatibility/2006" xmlns:aink="http://schemas.microsoft.com/office/drawing/2016/ink" xmlns:am3d="http://schemas.microsoft.com/office/drawing/2017/model3d" xmlns:o="urn:schemas-microsoft-com:office:office" xmlns:oel="http://schemas.microsoft.com/office/2019/extlst" xmlns:r="http://schemas.openxmlformats.org/officeDocument/2006/relationships" xmlns:m="http://schemas.openxmlformats.org/officeDocument/2006/math" xmlns:v="urn:schemas-microsoft-com:vml" xmlns:wp14="http://schemas.microsoft.com/office/word/2010/wordprocessingDrawing" xmlns:wp="http://schemas.openxmlformats.org/drawingml/2006/wordprocessingDrawing" xmlns:w10="urn:schemas-microsoft-com:office:word" xmlns:w="http://schemas.openxmlformats.org/wordprocessingml/2006/main" xmlns:w14="http://schemas.microsoft.com/office/word/2010/wordml" xmlns:w15="http://schemas.microsoft.com/office/word/2012/wordml" xmlns:w16cex="http://schemas.microsoft.com/office/word/2018/wordml/cex" xmlns:w16cid="http://schemas.microsoft.com/office/word/2016/wordml/cid" xmlns:w16="http://schemas.microsoft.com/office/word/2018/wordml" xmlns:w16du="http://schemas.microsoft.com/office/word/2023/wordml/word16du" xmlns:w16sdtdh="http://schemas.microsoft.com/office/word/2020/wordml/sdtdatahash" xmlns:w16sdtfl="http://schemas.microsoft.com/office/word/2024/wordml/sdtformatlock" xmlns:w16se="http://schemas.microsoft.com/office/word/2015/wordml/symex" xmlns:wpg="http://schemas.microsoft.com/office/word/2010/wordprocessingGroup" xmlns:wpi="http://schemas.microsoft.com/office/word/2010/wordprocessingInk" xmlns:wne="http://schemas.microsoft.com/office/word/2006/wordml" xmlns:wps="http://schemas.microsoft.com/office/word/2010/wordprocessingShape" mc:Ignorable="w14 w15 w16se w16cid w16 w16cex w16sdtdh w16sdtfl w16du wp14">
+<w:endnotes xmlns:wpc="http://schemas.microsoft.com/office/word/2010/wordprocessingCanvas" xmlns:cx="http://schemas.microsoft.com/office/drawing/2014/chartex" xmlns:cx1="http://schemas.microsoft.com/office/drawing/2015/9/8/chartex" xmlns:cx2="http://schemas.microsoft.com/office/drawing/2015/10/21/chartex" xmlns:cx3="http://schemas.microsoft.com/office/drawing/2016/5/9/chartex" xmlns:cx4="http://schemas.microsoft.com/office/drawing/2016/5/10/chartex" xmlns:cx5="http://schemas.microsoft.com/office/drawing/2016/5/11/chartex" xmlns:cx6="http://schemas.microsoft.com/office/drawing/2016/5/12/chartex" xmlns:cx7="http://schemas.microsoft.com/office/drawing/2016/5/13/chartex" xmlns:cx8="http://schemas.microsoft.com/office/drawing/2016/5/14/chartex" xmlns:mc="http://schemas.openxmlformats.org/markup-compatibility/2006" xmlns:m="http://schemas.openxmlformats.org/officeDocument/2006/math" xmlns:aink="http://schemas.microsoft.com/office/drawing/2016/ink" xmlns:am3d="http://schemas.microsoft.com/office/drawing/2017/model3d" xmlns:oel="http://schemas.microsoft.com/office/2019/extlst" xmlns:r="http://schemas.openxmlformats.org/officeDocument/2006/relationships" xmlns:wp14="http://schemas.microsoft.com/office/word/2010/wordprocessingDrawing" xmlns:wp="http://schemas.openxmlformats.org/drawingml/2006/wordprocessingDrawing" xmlns:wpg="http://schemas.microsoft.com/office/word/2010/wordprocessingGroup" xmlns:wpi="http://schemas.microsoft.com/office/word/2010/wordprocessingInk" xmlns:wps="http://schemas.microsoft.com/office/word/2010/wordprocessingShape" xmlns:o="urn:schemas-microsoft-com:office:office" xmlns:v="urn:schemas-microsoft-com:vml" xmlns:w10="urn:schemas-microsoft-com:office:word" xmlns:w="http://schemas.openxmlformats.org/wordprocessingml/2006/main" xmlns:w14="http://schemas.microsoft.com/office/word/2010/wordml" xmlns:w15="http://schemas.microsoft.com/office/word/2012/wordml" xmlns:w16cei="http://schemas.microsoft.com/office/word/2026/wordml/cei" xmlns:w16cex="http://schemas.microsoft.com/office/word/2018/wordml/cex" xmlns:w16cid="http://schemas.microsoft.com/office/word/2016/wordml/cid" xmlns:w16="http://schemas.microsoft.com/office/word/2018/wordml" xmlns:w16sdtdh="http://schemas.microsoft.com/office/word/2020/wordml/sdtdatahash" xmlns:w16sdtfl="http://schemas.microsoft.com/office/word/2024/wordml/sdtformatlock" xmlns:w16se="http://schemas.microsoft.com/office/word/2015/wordml/symex" xmlns:w16du="http://schemas.microsoft.com/office/word/2023/wordml/word16du" xmlns:wne="http://schemas.microsoft.com/office/word/2006/wordml" mc:Ignorable="w14 w15 w16se w16cid w16 w16cex w16sdtdh w16sdtfl w16du wp14">
   <w:endnote w:type="separator" w:id="-1">
     <w:p>
       <w:r>
@@ -13425,7 +13717,7 @@
 </file>
 
 <file path=word/footnotes.xml><?xml version="1.0" encoding="utf-8"?>
-<w:footnotes xmlns:wpc="http://schemas.microsoft.com/office/word/2010/wordprocessingCanvas" xmlns:cx="http://schemas.microsoft.com/office/drawing/2014/chartex" xmlns:cx1="http://schemas.microsoft.com/office/drawing/2015/9/8/chartex" xmlns:cx2="http://schemas.microsoft.com/office/drawing/2015/10/21/chartex" xmlns:cx3="http://schemas.microsoft.com/office/drawing/2016/5/9/chartex" xmlns:cx4="http://schemas.microsoft.com/office/drawing/2016/5/10/chartex" xmlns:cx5="http://schemas.microsoft.com/office/drawing/2016/5/11/chartex" xmlns:cx6="http://schemas.microsoft.com/office/drawing/2016/5/12/chartex" xmlns:cx7="http://schemas.microsoft.com/office/drawing/2016/5/13/chartex" xmlns:cx8="http://schemas.microsoft.com/office/drawing/2016/5/14/chartex" xmlns:mc="http://schemas.openxmlformats.org/markup-compatibility/2006" xmlns:aink="http://schemas.microsoft.com/office/drawing/2016/ink" xmlns:am3d="http://schemas.microsoft.com/office/drawing/2017/model3d" xmlns:o="urn:schemas-microsoft-com:office:office" xmlns:oel="http://schemas.microsoft.com/office/2019/extlst" xmlns:r="http://schemas.openxmlformats.org/officeDocument/2006/relationships" xmlns:m="http://schemas.openxmlformats.org/officeDocument/2006/math" xmlns:v="urn:schemas-microsoft-com:vml" xmlns:wp14="http://schemas.microsoft.com/office/word/2010/wordprocessingDrawing" xmlns:wp="http://schemas.openxmlformats.org/drawingml/2006/wordprocessingDrawing" xmlns:w10="urn:schemas-microsoft-com:office:word" xmlns:w="http://schemas.openxmlformats.org/wordprocessingml/2006/main" xmlns:w14="http://schemas.microsoft.com/office/word/2010/wordml" xmlns:w15="http://schemas.microsoft.com/office/word/2012/wordml" xmlns:w16cex="http://schemas.microsoft.com/office/word/2018/wordml/cex" xmlns:w16cid="http://schemas.microsoft.com/office/word/2016/wordml/cid" xmlns:w16="http://schemas.microsoft.com/office/word/2018/wordml" xmlns:w16du="http://schemas.microsoft.com/office/word/2023/wordml/word16du" xmlns:w16sdtdh="http://schemas.microsoft.com/office/word/2020/wordml/sdtdatahash" xmlns:w16sdtfl="http://schemas.microsoft.com/office/word/2024/wordml/sdtformatlock" xmlns:w16se="http://schemas.microsoft.com/office/word/2015/wordml/symex" xmlns:wpg="http://schemas.microsoft.com/office/word/2010/wordprocessingGroup" xmlns:wpi="http://schemas.microsoft.com/office/word/2010/wordprocessingInk" xmlns:wne="http://schemas.microsoft.com/office/word/2006/wordml" xmlns:wps="http://schemas.microsoft.com/office/word/2010/wordprocessingShape" mc:Ignorable="w14 w15 w16se w16cid w16 w16cex w16sdtdh w16sdtfl w16du wp14">
+<w:footnotes xmlns:wpc="http://schemas.microsoft.com/office/word/2010/wordprocessingCanvas" xmlns:cx="http://schemas.microsoft.com/office/drawing/2014/chartex" xmlns:cx1="http://schemas.microsoft.com/office/drawing/2015/9/8/chartex" xmlns:cx2="http://schemas.microsoft.com/office/drawing/2015/10/21/chartex" xmlns:cx3="http://schemas.microsoft.com/office/drawing/2016/5/9/chartex" xmlns:cx4="http://schemas.microsoft.com/office/drawing/2016/5/10/chartex" xmlns:cx5="http://schemas.microsoft.com/office/drawing/2016/5/11/chartex" xmlns:cx6="http://schemas.microsoft.com/office/drawing/2016/5/12/chartex" xmlns:cx7="http://schemas.microsoft.com/office/drawing/2016/5/13/chartex" xmlns:cx8="http://schemas.microsoft.com/office/drawing/2016/5/14/chartex" xmlns:mc="http://schemas.openxmlformats.org/markup-compatibility/2006" xmlns:m="http://schemas.openxmlformats.org/officeDocument/2006/math" xmlns:aink="http://schemas.microsoft.com/office/drawing/2016/ink" xmlns:am3d="http://schemas.microsoft.com/office/drawing/2017/model3d" xmlns:oel="http://schemas.microsoft.com/office/2019/extlst" xmlns:r="http://schemas.openxmlformats.org/officeDocument/2006/relationships" xmlns:wp14="http://schemas.microsoft.com/office/word/2010/wordprocessingDrawing" xmlns:wp="http://schemas.openxmlformats.org/drawingml/2006/wordprocessingDrawing" xmlns:wpg="http://schemas.microsoft.com/office/word/2010/wordprocessingGroup" xmlns:wpi="http://schemas.microsoft.com/office/word/2010/wordprocessingInk" xmlns:wps="http://schemas.microsoft.com/office/word/2010/wordprocessingShape" xmlns:o="urn:schemas-microsoft-com:office:office" xmlns:v="urn:schemas-microsoft-com:vml" xmlns:w10="urn:schemas-microsoft-com:office:word" xmlns:w="http://schemas.openxmlformats.org/wordprocessingml/2006/main" xmlns:w14="http://schemas.microsoft.com/office/word/2010/wordml" xmlns:w15="http://schemas.microsoft.com/office/word/2012/wordml" xmlns:w16cei="http://schemas.microsoft.com/office/word/2026/wordml/cei" xmlns:w16cex="http://schemas.microsoft.com/office/word/2018/wordml/cex" xmlns:w16cid="http://schemas.microsoft.com/office/word/2016/wordml/cid" xmlns:w16="http://schemas.microsoft.com/office/word/2018/wordml" xmlns:w16sdtdh="http://schemas.microsoft.com/office/word/2020/wordml/sdtdatahash" xmlns:w16sdtfl="http://schemas.microsoft.com/office/word/2024/wordml/sdtformatlock" xmlns:w16se="http://schemas.microsoft.com/office/word/2015/wordml/symex" xmlns:w16du="http://schemas.microsoft.com/office/word/2023/wordml/word16du" xmlns:wne="http://schemas.microsoft.com/office/word/2006/wordml" mc:Ignorable="w14 w15 w16se w16cid w16 w16cex w16sdtdh w16sdtfl w16du wp14">
   <w:footnote w:type="separator" w:id="-1">
     <w:p>
       <w:r>
@@ -13444,7 +13736,7 @@
 </file>
 
 <file path=word/numbering.xml><?xml version="1.0" encoding="utf-8"?>
-<w:numbering xmlns:wpc="http://schemas.microsoft.com/office/word/2010/wordprocessingCanvas" xmlns:cx="http://schemas.microsoft.com/office/drawing/2014/chartex" xmlns:cx1="http://schemas.microsoft.com/office/drawing/2015/9/8/chartex" xmlns:cx2="http://schemas.microsoft.com/office/drawing/2015/10/21/chartex" xmlns:cx3="http://schemas.microsoft.com/office/drawing/2016/5/9/chartex" xmlns:cx4="http://schemas.microsoft.com/office/drawing/2016/5/10/chartex" xmlns:cx5="http://schemas.microsoft.com/office/drawing/2016/5/11/chartex" xmlns:cx6="http://schemas.microsoft.com/office/drawing/2016/5/12/chartex" xmlns:cx7="http://schemas.microsoft.com/office/drawing/2016/5/13/chartex" xmlns:cx8="http://schemas.microsoft.com/office/drawing/2016/5/14/chartex" xmlns:mc="http://schemas.openxmlformats.org/markup-compatibility/2006" xmlns:aink="http://schemas.microsoft.com/office/drawing/2016/ink" xmlns:am3d="http://schemas.microsoft.com/office/drawing/2017/model3d" xmlns:o="urn:schemas-microsoft-com:office:office" xmlns:oel="http://schemas.microsoft.com/office/2019/extlst" xmlns:r="http://schemas.openxmlformats.org/officeDocument/2006/relationships" xmlns:m="http://schemas.openxmlformats.org/officeDocument/2006/math" xmlns:v="urn:schemas-microsoft-com:vml" xmlns:wp14="http://schemas.microsoft.com/office/word/2010/wordprocessingDrawing" xmlns:wp="http://schemas.openxmlformats.org/drawingml/2006/wordprocessingDrawing" xmlns:w10="urn:schemas-microsoft-com:office:word" xmlns:w="http://schemas.openxmlformats.org/wordprocessingml/2006/main" xmlns:w14="http://schemas.microsoft.com/office/word/2010/wordml" xmlns:w15="http://schemas.microsoft.com/office/word/2012/wordml" xmlns:w16cex="http://schemas.microsoft.com/office/word/2018/wordml/cex" xmlns:w16cid="http://schemas.microsoft.com/office/word/2016/wordml/cid" xmlns:w16="http://schemas.microsoft.com/office/word/2018/wordml" xmlns:w16du="http://schemas.microsoft.com/office/word/2023/wordml/word16du" xmlns:w16sdtdh="http://schemas.microsoft.com/office/word/2020/wordml/sdtdatahash" xmlns:w16sdtfl="http://schemas.microsoft.com/office/word/2024/wordml/sdtformatlock" xmlns:w16se="http://schemas.microsoft.com/office/word/2015/wordml/symex" xmlns:wpg="http://schemas.microsoft.com/office/word/2010/wordprocessingGroup" xmlns:wpi="http://schemas.microsoft.com/office/word/2010/wordprocessingInk" xmlns:wne="http://schemas.microsoft.com/office/word/2006/wordml" xmlns:wps="http://schemas.microsoft.com/office/word/2010/wordprocessingShape" mc:Ignorable="w14 w15 w16se w16cid w16 w16cex w16sdtdh w16sdtfl w16du wp14">
+<w:numbering xmlns:wpc="http://schemas.microsoft.com/office/word/2010/wordprocessingCanvas" xmlns:cx="http://schemas.microsoft.com/office/drawing/2014/chartex" xmlns:cx1="http://schemas.microsoft.com/office/drawing/2015/9/8/chartex" xmlns:cx2="http://schemas.microsoft.com/office/drawing/2015/10/21/chartex" xmlns:cx3="http://schemas.microsoft.com/office/drawing/2016/5/9/chartex" xmlns:cx4="http://schemas.microsoft.com/office/drawing/2016/5/10/chartex" xmlns:cx5="http://schemas.microsoft.com/office/drawing/2016/5/11/chartex" xmlns:cx6="http://schemas.microsoft.com/office/drawing/2016/5/12/chartex" xmlns:cx7="http://schemas.microsoft.com/office/drawing/2016/5/13/chartex" xmlns:cx8="http://schemas.microsoft.com/office/drawing/2016/5/14/chartex" xmlns:mc="http://schemas.openxmlformats.org/markup-compatibility/2006" xmlns:m="http://schemas.openxmlformats.org/officeDocument/2006/math" xmlns:aink="http://schemas.microsoft.com/office/drawing/2016/ink" xmlns:am3d="http://schemas.microsoft.com/office/drawing/2017/model3d" xmlns:oel="http://schemas.microsoft.com/office/2019/extlst" xmlns:r="http://schemas.openxmlformats.org/officeDocument/2006/relationships" xmlns:wp14="http://schemas.microsoft.com/office/word/2010/wordprocessingDrawing" xmlns:wp="http://schemas.openxmlformats.org/drawingml/2006/wordprocessingDrawing" xmlns:wpg="http://schemas.microsoft.com/office/word/2010/wordprocessingGroup" xmlns:wpi="http://schemas.microsoft.com/office/word/2010/wordprocessingInk" xmlns:wps="http://schemas.microsoft.com/office/word/2010/wordprocessingShape" xmlns:o="urn:schemas-microsoft-com:office:office" xmlns:v="urn:schemas-microsoft-com:vml" xmlns:w10="urn:schemas-microsoft-com:office:word" xmlns:w="http://schemas.openxmlformats.org/wordprocessingml/2006/main" xmlns:w14="http://schemas.microsoft.com/office/word/2010/wordml" xmlns:w15="http://schemas.microsoft.com/office/word/2012/wordml" xmlns:w16cei="http://schemas.microsoft.com/office/word/2026/wordml/cei" xmlns:w16cex="http://schemas.microsoft.com/office/word/2018/wordml/cex" xmlns:w16cid="http://schemas.microsoft.com/office/word/2016/wordml/cid" xmlns:w16="http://schemas.microsoft.com/office/word/2018/wordml" xmlns:w16sdtdh="http://schemas.microsoft.com/office/word/2020/wordml/sdtdatahash" xmlns:w16sdtfl="http://schemas.microsoft.com/office/word/2024/wordml/sdtformatlock" xmlns:w16se="http://schemas.microsoft.com/office/word/2015/wordml/symex" xmlns:w16du="http://schemas.microsoft.com/office/word/2023/wordml/word16du" xmlns:wne="http://schemas.microsoft.com/office/word/2006/wordml" mc:Ignorable="w14 w15 w16se w16cid w16 w16cex w16sdtdh w16sdtfl w16du wp14">
   <w:abstractNum w:abstractNumId="0" w15:restartNumberingAfterBreak="0">
     <w:nsid w:val="1A794D10"/>
     <w:multiLevelType w:val="hybridMultilevel"/>
@@ -13722,7 +14014,7 @@
 </file>
 
 <file path=word/styles.xml><?xml version="1.0" encoding="utf-8"?>
-<w:styles xmlns:mc="http://schemas.openxmlformats.org/markup-compatibility/2006" xmlns:r="http://schemas.openxmlformats.org/officeDocument/2006/relationships" xmlns:w="http://schemas.openxmlformats.org/wordprocessingml/2006/main" xmlns:w14="http://schemas.microsoft.com/office/word/2010/wordml" xmlns:w15="http://schemas.microsoft.com/office/word/2012/wordml" xmlns:w16cex="http://schemas.microsoft.com/office/word/2018/wordml/cex" xmlns:w16cid="http://schemas.microsoft.com/office/word/2016/wordml/cid" xmlns:w16="http://schemas.microsoft.com/office/word/2018/wordml" xmlns:w16du="http://schemas.microsoft.com/office/word/2023/wordml/word16du" xmlns:w16sdtdh="http://schemas.microsoft.com/office/word/2020/wordml/sdtdatahash" xmlns:w16sdtfl="http://schemas.microsoft.com/office/word/2024/wordml/sdtformatlock" xmlns:w16se="http://schemas.microsoft.com/office/word/2015/wordml/symex" mc:Ignorable="w14 w15 w16se w16cid w16 w16cex w16sdtdh w16sdtfl w16du">
+<w:styles xmlns:mc="http://schemas.openxmlformats.org/markup-compatibility/2006" xmlns:r="http://schemas.openxmlformats.org/officeDocument/2006/relationships" xmlns:w="http://schemas.openxmlformats.org/wordprocessingml/2006/main" xmlns:w14="http://schemas.microsoft.com/office/word/2010/wordml" xmlns:w15="http://schemas.microsoft.com/office/word/2012/wordml" xmlns:w16cex="http://schemas.microsoft.com/office/word/2018/wordml/cex" xmlns:w16cid="http://schemas.microsoft.com/office/word/2016/wordml/cid" xmlns:w16="http://schemas.microsoft.com/office/word/2018/wordml" xmlns:w16sdtdh="http://schemas.microsoft.com/office/word/2020/wordml/sdtdatahash" xmlns:w16sdtfl="http://schemas.microsoft.com/office/word/2024/wordml/sdtformatlock" xmlns:w16se="http://schemas.microsoft.com/office/word/2015/wordml/symex" xmlns:w16du="http://schemas.microsoft.com/office/word/2023/wordml/word16du" mc:Ignorable="w14 w15 w16se w16cid w16 w16cex w16sdtdh w16sdtfl w16du">
   <w:docDefaults>
     <w:rPrDefault>
       <w:rPr>

</xml_diff>